<commit_message>
Update research plan framing
</commit_message>
<xml_diff>
--- a/machine-psychology-project-manager/documents/Machine_Psychology_Year1_Research_Plan_v10.docx
+++ b/machine-psychology-project-manager/documents/Machine_Psychology_Year1_Research_Plan_v10.docx
@@ -946,8 +946,7 @@
         <w:spacing w:after="160"/>
       </w:pPr>
       <w:r>
-        <w:lastRenderedPageBreak/>
-        <w:t>Most LLM psychology studies use custom pipelines that are not released, test one or two model families, and do not preregister analytic plans. This makes cross-study comparison nearly impossible. The field needs standardized infrastructure with validated parsing, scoring, and replication norms, the same need that contemplative science faced after Van Dam et al. (2018) and that resulted in registered replication programs.</w:t>
+        <w:t>Most LLM psychology studies use custom pipelines that are not released, test one or two model families, and do not preregister analytic plans. This makes cross-study comparison nearly impossible. The field needs standardized infrastructure with validated parsing, scoring, and replication norms, building on the registered replication practices advanced across cognitive science (Simons et al., 2014).</w:t>
       </w:r>
     </w:p>
     <w:p>
@@ -1125,15 +1124,7 @@
         <w:spacing w:after="160"/>
       </w:pPr>
       <w:r>
-        <w:t>This project is significant for three reasons. First, it provides the field with validated infrastructure (</w:t>
-      </w:r>
-      <w:proofErr w:type="spellStart"/>
-      <w:r>
-        <w:t>AutoPsych</w:t>
-      </w:r>
-      <w:proofErr w:type="spellEnd"/>
-      <w:r>
-        <w:t>) and a methodological template (parameterized Fermi estimation with contamination auditing) that other laboratories can use. Second, functional metacognitive monitoring, whether confidence tracks error, has direct implications for AI deployment safety, and this project will produce the first cross-configuration characterization under controlled conditions. Third, the metacognition paradigm connects to fundamental questions about introspective accuracy that motivate the PI's broader research program in contemplative science, creating a bridge to interdisciplinary funding unavailable to a purely technical AI program.</w:t>
+        <w:t>This project is significant for three reasons. First, it provides the field with validated infrastructure (AutoPsych) and a methodological template (parameterized Fermi estimation with contamination auditing) that other laboratories can use. Second, functional metacognitive monitoring, whether confidence tracks error, has direct implications for AI deployment safety, and this project will produce the first cross-configuration characterization under controlled conditions. Third, the metacognition paradigm connects to fundamental questions about introspective accuracy that motivate the PI's broader research program in cognitive science, creating a bridge to interdisciplinary funding unavailable to a purely technical AI program.</w:t>
       </w:r>
     </w:p>
     <w:p>
@@ -9987,14 +9978,7 @@
         <w:spacing w:after="160"/>
       </w:pPr>
       <w:r>
-        <w:rPr>
-          <w:b/>
-          <w:bCs/>
-        </w:rPr>
-        <w:t xml:space="preserve">Years 4-5: Cross-family generalization and grant development. </w:t>
-      </w:r>
-      <w:r>
-        <w:t>Target NSF CISE programs bridging cognitive science and AI safety, and Templeton Foundation programs connecting to contemplative-science questions about introspective accuracy. The project creates a future bridge to human introspection research by developing behavioral measures of confidence, error monitoring, and revision that can later be administered in parallel to humans and models. This parallel-measurement design, testing whether the same Fermi paradigm reveals comparable or systematically divergent confidence-accuracy relationships in human meditators versus LLMs, positions the program for Templeton and Mind &amp; Life funding otherwise unavailable to a pure AI program.</w:t>
+        <w:t>Years 4-5: Cross-family generalization and grant development. Target NSF CISE programs bridging cognitive science and AI safety, along with funders supporting cognitive science research on metacognition and AI safety. The project creates a future bridge to human cognitive-science research by developing behavioral measures of confidence, error monitoring, and revision that can later be administered in parallel to humans and models. This parallel-measurement design, testing whether the same Fermi paradigm reveals comparable or systematically divergent confidence-accuracy relationships in human participants versus LLMs, positions the program for interdisciplinary cognitive-science and AI-safety funding beyond a purely technical AI program.</w:t>
       </w:r>
     </w:p>
     <w:p>
@@ -10457,11 +10441,7 @@
         <w:ind w:left="360" w:hanging="360"/>
       </w:pPr>
       <w:r>
-        <w:rPr>
-          <w:sz w:val="20"/>
-          <w:szCs w:val="20"/>
-        </w:rPr>
-        <w:t>Van Dam, N. T., van Vugt, M. K., Vago, D. R., Schmalzl, L., Saron, C. D., Olendzki, A., Meissner, T., Lazar, S. W., Gorchov, Y., Fox, K. C. R., Field, B. A., Britton, W. B., Brefczynski-Lewis, J. A., &amp; Meyer, D. E. (2018). Mind the hype: A critical evaluation and prescriptive agenda for research on mindfulness and meditation. Perspectives on Psychological Science, 13(1), 36-61.</w:t>
+        <w:t>Simons, D. J., Holcombe, A. O., &amp; Spellman, B. A. (2014). An introduction to Registered Replication Reports at Perspectives on Psychological Science. Perspectives on Psychological Science, 9(5), 552-555. https://doi.org/10.1177/1745691614543974</w:t>
       </w:r>
     </w:p>
     <w:p>

</xml_diff>